<commit_message>
fix:- add file Case Study
</commit_message>
<xml_diff>
--- a/docs/🧾 Case Study-HMS.docx
+++ b/docs/🧾 Case Study-HMS.docx
@@ -341,7 +341,7 @@
           <w:szCs w:val="24"/>
         </w:rPr>
         <w:pict w14:anchorId="489D9F5E">
-          <v:rect id="_x0000_i1207" style="width:0;height:1.5pt" o:hralign="center" o:hrstd="t" o:hr="t" fillcolor="#a0a0a0" stroked="f"/>
+          <v:rect id="_x0000_i1025" style="width:0;height:1.5pt" o:hralign="center" o:hrstd="t" o:hr="t" fillcolor="#a0a0a0" stroked="f"/>
         </w:pict>
       </w:r>
     </w:p>
@@ -754,7 +754,7 @@
           <w:szCs w:val="24"/>
         </w:rPr>
         <w:pict w14:anchorId="61F7AABE">
-          <v:rect id="_x0000_i1208" style="width:0;height:1.5pt" o:hralign="center" o:hrstd="t" o:hr="t" fillcolor="#a0a0a0" stroked="f"/>
+          <v:rect id="_x0000_i1026" style="width:0;height:1.5pt" o:hralign="center" o:hrstd="t" o:hr="t" fillcolor="#a0a0a0" stroked="f"/>
         </w:pict>
       </w:r>
     </w:p>
@@ -900,7 +900,7 @@
     </w:p>
     <w:tbl>
       <w:tblPr>
-        <w:tblW w:w="0" w:type="auto"/>
+        <w:tblW w:w="8699" w:type="dxa"/>
         <w:tblCellSpacing w:w="15" w:type="dxa"/>
         <w:tblCellMar>
           <w:top w:w="15" w:type="dxa"/>
@@ -911,11 +911,12 @@
         <w:tblLook w:val="04A0" w:firstRow="1" w:lastRow="0" w:firstColumn="1" w:lastColumn="0" w:noHBand="0" w:noVBand="1"/>
       </w:tblPr>
       <w:tblGrid>
-        <w:gridCol w:w="1435"/>
-        <w:gridCol w:w="3028"/>
+        <w:gridCol w:w="2781"/>
+        <w:gridCol w:w="5918"/>
       </w:tblGrid>
       <w:tr>
         <w:trPr>
+          <w:trHeight w:val="412"/>
           <w:tblHeader/>
           <w:tblCellSpacing w:w="15" w:type="dxa"/>
         </w:trPr>
@@ -980,6 +981,7 @@
       </w:tr>
       <w:tr>
         <w:trPr>
+          <w:trHeight w:val="412"/>
           <w:tblCellSpacing w:w="15" w:type="dxa"/>
         </w:trPr>
         <w:tc>
@@ -1035,6 +1037,7 @@
       </w:tr>
       <w:tr>
         <w:trPr>
+          <w:trHeight w:val="412"/>
           <w:tblCellSpacing w:w="15" w:type="dxa"/>
         </w:trPr>
         <w:tc>
@@ -1090,6 +1093,7 @@
       </w:tr>
       <w:tr>
         <w:trPr>
+          <w:trHeight w:val="397"/>
           <w:tblCellSpacing w:w="15" w:type="dxa"/>
         </w:trPr>
         <w:tc>
@@ -1145,6 +1149,7 @@
       </w:tr>
       <w:tr>
         <w:trPr>
+          <w:trHeight w:val="412"/>
           <w:tblCellSpacing w:w="15" w:type="dxa"/>
         </w:trPr>
         <w:tc>
@@ -1200,6 +1205,7 @@
       </w:tr>
       <w:tr>
         <w:trPr>
+          <w:trHeight w:val="412"/>
           <w:tblCellSpacing w:w="15" w:type="dxa"/>
         </w:trPr>
         <w:tc>
@@ -1255,6 +1261,7 @@
       </w:tr>
       <w:tr>
         <w:trPr>
+          <w:trHeight w:val="412"/>
           <w:tblCellSpacing w:w="15" w:type="dxa"/>
         </w:trPr>
         <w:tc>
@@ -1325,7 +1332,7 @@
           <w:szCs w:val="24"/>
         </w:rPr>
         <w:pict w14:anchorId="755E33CE">
-          <v:rect id="_x0000_i1209" style="width:0;height:1.5pt" o:hralign="center" o:hrstd="t" o:hr="t" fillcolor="#a0a0a0" stroked="f"/>
+          <v:rect id="_x0000_i1027" style="width:0;height:1.5pt" o:hralign="center" o:hrstd="t" o:hr="t" fillcolor="#a0a0a0" stroked="f"/>
         </w:pict>
       </w:r>
     </w:p>
@@ -1978,7 +1985,7 @@
           <w:szCs w:val="24"/>
         </w:rPr>
         <w:pict w14:anchorId="39F65E8C">
-          <v:rect id="_x0000_i1210" style="width:0;height:1.5pt" o:hralign="center" o:hrstd="t" o:hr="t" fillcolor="#a0a0a0" stroked="f"/>
+          <v:rect id="_x0000_i1028" style="width:0;height:1.5pt" o:hralign="center" o:hrstd="t" o:hr="t" fillcolor="#a0a0a0" stroked="f"/>
         </w:pict>
       </w:r>
     </w:p>
@@ -2212,7 +2219,7 @@
           <w:szCs w:val="24"/>
         </w:rPr>
         <w:pict w14:anchorId="3B95EC50">
-          <v:rect id="_x0000_i1211" style="width:0;height:1.5pt" o:hralign="center" o:hrstd="t" o:hr="t" fillcolor="#a0a0a0" stroked="f"/>
+          <v:rect id="_x0000_i1029" style="width:0;height:1.5pt" o:hralign="center" o:hrstd="t" o:hr="t" fillcolor="#a0a0a0" stroked="f"/>
         </w:pict>
       </w:r>
     </w:p>
@@ -2320,7 +2327,7 @@
           <w:szCs w:val="24"/>
         </w:rPr>
         <w:pict w14:anchorId="01978F89">
-          <v:rect id="_x0000_i1212" style="width:0;height:1.5pt" o:hralign="center" o:hrstd="t" o:hr="t" fillcolor="#a0a0a0" stroked="f"/>
+          <v:rect id="_x0000_i1030" style="width:0;height:1.5pt" o:hralign="center" o:hrstd="t" o:hr="t" fillcolor="#a0a0a0" stroked="f"/>
         </w:pict>
       </w:r>
     </w:p>
@@ -2474,7 +2481,7 @@
           <w:szCs w:val="24"/>
         </w:rPr>
         <w:pict w14:anchorId="2E6A1F69">
-          <v:rect id="_x0000_i1213" style="width:0;height:1.5pt" o:hralign="center" o:hrstd="t" o:hr="t" fillcolor="#a0a0a0" stroked="f"/>
+          <v:rect id="_x0000_i1031" style="width:0;height:1.5pt" o:hralign="center" o:hrstd="t" o:hr="t" fillcolor="#a0a0a0" stroked="f"/>
         </w:pict>
       </w:r>
     </w:p>
@@ -2628,7 +2635,7 @@
           <w:szCs w:val="24"/>
         </w:rPr>
         <w:pict w14:anchorId="3843D22B">
-          <v:rect id="_x0000_i1214" style="width:0;height:1.5pt" o:hralign="center" o:hrstd="t" o:hr="t" fillcolor="#a0a0a0" stroked="f"/>
+          <v:rect id="_x0000_i1032" style="width:0;height:1.5pt" o:hralign="center" o:hrstd="t" o:hr="t" fillcolor="#a0a0a0" stroked="f"/>
         </w:pict>
       </w:r>
     </w:p>
@@ -3071,7 +3078,7 @@
         </w:rPr>
         <w:lastRenderedPageBreak/>
         <w:pict w14:anchorId="1CE2847E">
-          <v:rect id="_x0000_i1215" style="width:0;height:1.5pt" o:hralign="center" o:hrstd="t" o:hr="t" fillcolor="#a0a0a0" stroked="f"/>
+          <v:rect id="_x0000_i1033" style="width:0;height:1.5pt" o:hralign="center" o:hrstd="t" o:hr="t" fillcolor="#a0a0a0" stroked="f"/>
         </w:pict>
       </w:r>
     </w:p>
@@ -3309,7 +3316,7 @@
           <w:szCs w:val="24"/>
         </w:rPr>
         <w:pict w14:anchorId="39018EDF">
-          <v:rect id="_x0000_i1216" style="width:0;height:1.5pt" o:hralign="center" o:hrstd="t" o:hr="t" fillcolor="#a0a0a0" stroked="f"/>
+          <v:rect id="_x0000_i1034" style="width:0;height:1.5pt" o:hralign="center" o:hrstd="t" o:hr="t" fillcolor="#a0a0a0" stroked="f"/>
         </w:pict>
       </w:r>
     </w:p>
@@ -3499,7 +3506,7 @@
           <w:szCs w:val="24"/>
         </w:rPr>
         <w:pict w14:anchorId="0BD2C43A">
-          <v:rect id="_x0000_i1217" style="width:0;height:1.5pt" o:hralign="center" o:hrstd="t" o:hr="t" fillcolor="#a0a0a0" stroked="f"/>
+          <v:rect id="_x0000_i1035" style="width:0;height:1.5pt" o:hralign="center" o:hrstd="t" o:hr="t" fillcolor="#a0a0a0" stroked="f"/>
         </w:pict>
       </w:r>
     </w:p>
@@ -3782,7 +3789,7 @@
           <w:szCs w:val="24"/>
         </w:rPr>
         <w:pict w14:anchorId="2FBE95ED">
-          <v:rect id="_x0000_i1218" style="width:0;height:1.5pt" o:hralign="center" o:hrstd="t" o:hr="t" fillcolor="#a0a0a0" stroked="f"/>
+          <v:rect id="_x0000_i1036" style="width:0;height:1.5pt" o:hralign="center" o:hrstd="t" o:hr="t" fillcolor="#a0a0a0" stroked="f"/>
         </w:pict>
       </w:r>
     </w:p>
@@ -3944,7 +3951,7 @@
           <w:szCs w:val="24"/>
         </w:rPr>
         <w:pict w14:anchorId="3D8A690F">
-          <v:rect id="_x0000_i1219" style="width:0;height:1.5pt" o:hralign="center" o:hrstd="t" o:hr="t" fillcolor="#a0a0a0" stroked="f"/>
+          <v:rect id="_x0000_i1037" style="width:0;height:1.5pt" o:hralign="center" o:hrstd="t" o:hr="t" fillcolor="#a0a0a0" stroked="f"/>
         </w:pict>
       </w:r>
     </w:p>
@@ -4098,7 +4105,7 @@
           <w:szCs w:val="24"/>
         </w:rPr>
         <w:pict w14:anchorId="01ED34A0">
-          <v:rect id="_x0000_i1220" style="width:0;height:1.5pt" o:hralign="center" o:hrstd="t" o:hr="t" fillcolor="#a0a0a0" stroked="f"/>
+          <v:rect id="_x0000_i1038" style="width:0;height:1.5pt" o:hralign="center" o:hrstd="t" o:hr="t" fillcolor="#a0a0a0" stroked="f"/>
         </w:pict>
       </w:r>
     </w:p>
@@ -7364,6 +7371,7 @@
   <w:style w:type="character" w:default="1" w:styleId="DefaultParagraphFont">
     <w:name w:val="Default Paragraph Font"/>
     <w:uiPriority w:val="1"/>
+    <w:semiHidden/>
     <w:unhideWhenUsed/>
   </w:style>
   <w:style w:type="table" w:default="1" w:styleId="TableNormal">

</xml_diff>